<commit_message>
Sistema Fk primer intento (en proceso)
</commit_message>
<xml_diff>
--- a/InstruccionesChatGpt_Word/InstruccionesChatGpt_Word_012_MedidasLateralEstandar.docx
+++ b/InstruccionesChatGpt_Word/InstruccionesChatGpt_Word_012_MedidasLateralEstandar.docx
@@ -3480,8 +3480,13 @@
               <w:jc w:val="center"/>
             </w:pPr>
             <w:r>
-              <w:t>Animal Crossing</w:t>
-            </w:r>
+              <w:t xml:space="preserve">Animal </w:t>
+            </w:r>
+            <w:proofErr w:type="spellStart"/>
+            <w:r>
+              <w:t>Crossing</w:t>
+            </w:r>
+            <w:proofErr w:type="spellEnd"/>
           </w:p>
         </w:tc>
         <w:tc>
@@ -3925,8 +3930,13 @@
               </w:rPr>
             </w:pPr>
             <w:r>
-              <w:t>3d.bysarah</w:t>
-            </w:r>
+              <w:t>3</w:t>
+            </w:r>
+            <w:proofErr w:type="gramStart"/>
+            <w:r>
+              <w:t>d.bysarah</w:t>
+            </w:r>
+            <w:proofErr w:type="gramEnd"/>
           </w:p>
         </w:tc>
         <w:tc>
@@ -4174,7 +4184,15 @@
           </w:tcPr>
           <w:p>
             <w:r>
-              <w:t>Empresa japonesa reconocida por la creación de personajes icónicos dentro de la estética kawaii, caracterizados por su simplicidad formal, formas redondeadas y alta carga emocional.</w:t>
+              <w:t xml:space="preserve">Empresa japonesa reconocida por la creación de personajes icónicos dentro de la estética </w:t>
+            </w:r>
+            <w:proofErr w:type="spellStart"/>
+            <w:r>
+              <w:t>kawaii</w:t>
+            </w:r>
+            <w:proofErr w:type="spellEnd"/>
+            <w:r>
+              <w:t>, caracterizados por su simplicidad formal, formas redondeadas y alta carga emocional.</w:t>
             </w:r>
           </w:p>
         </w:tc>
@@ -4584,8 +4602,17 @@
                 <w:rStyle w:val="Textoennegrita"/>
                 <w:shd w:val="clear" w:color="auto" w:fill="F0F8DE" w:themeFill="accent3" w:themeFillTint="33"/>
               </w:rPr>
-              <w:t>500 a 2000 quads</w:t>
-            </w:r>
+              <w:t xml:space="preserve">500 a 2000 </w:t>
+            </w:r>
+            <w:proofErr w:type="spellStart"/>
+            <w:r>
+              <w:rPr>
+                <w:rStyle w:val="Textoennegrita"/>
+                <w:shd w:val="clear" w:color="auto" w:fill="F0F8DE" w:themeFill="accent3" w:themeFillTint="33"/>
+              </w:rPr>
+              <w:t>quads</w:t>
+            </w:r>
+            <w:proofErr w:type="spellEnd"/>
             <w:r>
               <w:rPr>
                 <w:rStyle w:val="Textoennegrita"/>
@@ -4680,9 +4707,27 @@
                 <w:lang w:val="en-CA"/>
               </w:rPr>
             </w:pPr>
-            <w:r>
-              <w:t>Spore Creature Creator</w:t>
-            </w:r>
+            <w:proofErr w:type="spellStart"/>
+            <w:r>
+              <w:t>Spore</w:t>
+            </w:r>
+            <w:proofErr w:type="spellEnd"/>
+            <w:r>
+              <w:t xml:space="preserve"> </w:t>
+            </w:r>
+            <w:proofErr w:type="spellStart"/>
+            <w:r>
+              <w:t>Creature</w:t>
+            </w:r>
+            <w:proofErr w:type="spellEnd"/>
+            <w:r>
+              <w:t xml:space="preserve"> </w:t>
+            </w:r>
+            <w:proofErr w:type="spellStart"/>
+            <w:r>
+              <w:t>Creator</w:t>
+            </w:r>
+            <w:proofErr w:type="spellEnd"/>
           </w:p>
         </w:tc>
         <w:tc>
@@ -4698,7 +4743,23 @@
               </w:rPr>
             </w:pPr>
             <w:r>
-              <w:t>Sistema de creación procedural de criaturas basado en la combinación de estructuras (metaballs) y piezas predefinidas (rigblocks), complementado con texturizado</w:t>
+              <w:t>Sistema de creación procedural de criaturas basado en la combinación de estructuras (</w:t>
+            </w:r>
+            <w:proofErr w:type="spellStart"/>
+            <w:r>
+              <w:t>metaballs</w:t>
+            </w:r>
+            <w:proofErr w:type="spellEnd"/>
+            <w:r>
+              <w:t>) y piezas predefinidas (</w:t>
+            </w:r>
+            <w:proofErr w:type="spellStart"/>
+            <w:r>
+              <w:t>rigblocks</w:t>
+            </w:r>
+            <w:proofErr w:type="spellEnd"/>
+            <w:r>
+              <w:t>), complementado con texturizado</w:t>
             </w:r>
             <w:r>
               <w:t xml:space="preserve"> </w:t>
@@ -4744,6 +4805,7 @@
               </w:rPr>
               <w:t xml:space="preserve">con arquitectura </w:t>
             </w:r>
+            <w:proofErr w:type="spellStart"/>
             <w:r>
               <w:rPr>
                 <w:rFonts w:asciiTheme="minorHAnsi" w:hAnsiTheme="minorHAnsi"/>
@@ -4766,6 +4828,7 @@
               </w:rPr>
               <w:t>ar</w:t>
             </w:r>
+            <w:proofErr w:type="spellEnd"/>
             <w:r>
               <w:rPr>
                 <w:rFonts w:asciiTheme="minorHAnsi" w:hAnsiTheme="minorHAnsi"/>
@@ -4867,7 +4930,23 @@
           </w:tcPr>
           <w:p>
             <w:r>
-              <w:t>Diseño emocional (Emotional Design)</w:t>
+              <w:t>Diseño emocional (</w:t>
+            </w:r>
+            <w:proofErr w:type="spellStart"/>
+            <w:r>
+              <w:t>Emotional</w:t>
+            </w:r>
+            <w:proofErr w:type="spellEnd"/>
+            <w:r>
+              <w:t xml:space="preserve"> </w:t>
+            </w:r>
+            <w:proofErr w:type="spellStart"/>
+            <w:r>
+              <w:t>Design</w:t>
+            </w:r>
+            <w:proofErr w:type="spellEnd"/>
+            <w:r>
+              <w:t>)</w:t>
             </w:r>
           </w:p>
         </w:tc>
@@ -4976,7 +5055,31 @@
                 <w:szCs w:val="20"/>
                 <w:shd w:val="clear" w:color="auto" w:fill="F0F8DE" w:themeFill="accent3" w:themeFillTint="33"/>
               </w:rPr>
-              <w:t>por medio de colores  pasteles y formas redondeadas</w:t>
+              <w:t xml:space="preserve">por medio de </w:t>
+            </w:r>
+            <w:proofErr w:type="gramStart"/>
+            <w:r>
+              <w:rPr>
+                <w:rFonts w:asciiTheme="minorHAnsi" w:hAnsiTheme="minorHAnsi"/>
+                <w:b/>
+                <w:bCs/>
+                <w:sz w:val="20"/>
+                <w:szCs w:val="20"/>
+                <w:shd w:val="clear" w:color="auto" w:fill="F0F8DE" w:themeFill="accent3" w:themeFillTint="33"/>
+              </w:rPr>
+              <w:t>colores  pasteles</w:t>
+            </w:r>
+            <w:proofErr w:type="gramEnd"/>
+            <w:r>
+              <w:rPr>
+                <w:rFonts w:asciiTheme="minorHAnsi" w:hAnsiTheme="minorHAnsi"/>
+                <w:b/>
+                <w:bCs/>
+                <w:sz w:val="20"/>
+                <w:szCs w:val="20"/>
+                <w:shd w:val="clear" w:color="auto" w:fill="F0F8DE" w:themeFill="accent3" w:themeFillTint="33"/>
+              </w:rPr>
+              <w:t xml:space="preserve"> y formas redondeadas</w:t>
             </w:r>
             <w:r>
               <w:rPr>
@@ -5204,7 +5307,25 @@
                 <w:sz w:val="20"/>
                 <w:szCs w:val="20"/>
               </w:rPr>
-              <w:t>Con estos métodos se pueden lograr estilos cartoon, transiciones de color o gradientes, variaciones en textura, color o relieve y la respuesta a la luz.</w:t>
+              <w:t xml:space="preserve">Con estos métodos se pueden lograr estilos </w:t>
+            </w:r>
+            <w:proofErr w:type="spellStart"/>
+            <w:r>
+              <w:rPr>
+                <w:rFonts w:asciiTheme="minorHAnsi" w:hAnsiTheme="minorHAnsi"/>
+                <w:sz w:val="20"/>
+                <w:szCs w:val="20"/>
+              </w:rPr>
+              <w:t>cartoon</w:t>
+            </w:r>
+            <w:proofErr w:type="spellEnd"/>
+            <w:r>
+              <w:rPr>
+                <w:rFonts w:asciiTheme="minorHAnsi" w:hAnsiTheme="minorHAnsi"/>
+                <w:sz w:val="20"/>
+                <w:szCs w:val="20"/>
+              </w:rPr>
+              <w:t>, transiciones de color o gradientes, variaciones en textura, color o relieve y la respuesta a la luz.</w:t>
             </w:r>
           </w:p>
         </w:tc>
@@ -5252,7 +5373,31 @@
                 <w:szCs w:val="20"/>
                 <w:shd w:val="clear" w:color="auto" w:fill="F0F8DE" w:themeFill="accent3" w:themeFillTint="33"/>
               </w:rPr>
-              <w:t>de shaders:</w:t>
+              <w:t xml:space="preserve">de </w:t>
+            </w:r>
+            <w:proofErr w:type="spellStart"/>
+            <w:r>
+              <w:rPr>
+                <w:rFonts w:asciiTheme="minorHAnsi" w:hAnsiTheme="minorHAnsi"/>
+                <w:b/>
+                <w:bCs/>
+                <w:sz w:val="20"/>
+                <w:szCs w:val="20"/>
+                <w:shd w:val="clear" w:color="auto" w:fill="F0F8DE" w:themeFill="accent3" w:themeFillTint="33"/>
+              </w:rPr>
+              <w:t>shaders</w:t>
+            </w:r>
+            <w:proofErr w:type="spellEnd"/>
+            <w:r>
+              <w:rPr>
+                <w:rFonts w:asciiTheme="minorHAnsi" w:hAnsiTheme="minorHAnsi"/>
+                <w:b/>
+                <w:bCs/>
+                <w:sz w:val="20"/>
+                <w:szCs w:val="20"/>
+                <w:shd w:val="clear" w:color="auto" w:fill="F0F8DE" w:themeFill="accent3" w:themeFillTint="33"/>
+              </w:rPr>
+              <w:t>:</w:t>
             </w:r>
             <w:r>
               <w:rPr>
@@ -5260,39 +5405,43 @@
                 <w:sz w:val="20"/>
                 <w:szCs w:val="20"/>
               </w:rPr>
-              <w:t xml:space="preserve"> El toon shader establece la base estética caricaturesca</w:t>
-            </w:r>
+              <w:t xml:space="preserve"> El </w:t>
+            </w:r>
+            <w:proofErr w:type="spellStart"/>
             <w:r>
               <w:rPr>
                 <w:rFonts w:asciiTheme="minorHAnsi" w:hAnsiTheme="minorHAnsi"/>
                 <w:sz w:val="20"/>
                 <w:szCs w:val="20"/>
               </w:rPr>
-              <w:t xml:space="preserve">, </w:t>
-            </w:r>
+              <w:t>toon</w:t>
+            </w:r>
+            <w:proofErr w:type="spellEnd"/>
             <w:r>
               <w:rPr>
                 <w:rFonts w:asciiTheme="minorHAnsi" w:hAnsiTheme="minorHAnsi"/>
                 <w:sz w:val="20"/>
                 <w:szCs w:val="20"/>
               </w:rPr>
-              <w:t>el ramp shader define la cohesión cromática</w:t>
-            </w:r>
+              <w:t xml:space="preserve"> </w:t>
+            </w:r>
+            <w:proofErr w:type="spellStart"/>
             <w:r>
               <w:rPr>
                 <w:rFonts w:asciiTheme="minorHAnsi" w:hAnsiTheme="minorHAnsi"/>
                 <w:sz w:val="20"/>
                 <w:szCs w:val="20"/>
               </w:rPr>
-              <w:t>, e</w:t>
-            </w:r>
+              <w:t>shader</w:t>
+            </w:r>
+            <w:proofErr w:type="spellEnd"/>
             <w:r>
               <w:rPr>
                 <w:rFonts w:asciiTheme="minorHAnsi" w:hAnsiTheme="minorHAnsi"/>
                 <w:sz w:val="20"/>
                 <w:szCs w:val="20"/>
               </w:rPr>
-              <w:t xml:space="preserve">l noise shader se utiliza para introducir microvariaciones superficiales que sugieren cualidades táctiles </w:t>
+              <w:t xml:space="preserve"> establece la base estética caricaturesca</w:t>
             </w:r>
             <w:r>
               <w:rPr>
@@ -5300,7 +5449,7 @@
                 <w:sz w:val="20"/>
                 <w:szCs w:val="20"/>
               </w:rPr>
-              <w:t xml:space="preserve">y el </w:t>
+              <w:t xml:space="preserve">, </w:t>
             </w:r>
             <w:r>
               <w:rPr>
@@ -5308,7 +5457,139 @@
                 <w:sz w:val="20"/>
                 <w:szCs w:val="20"/>
               </w:rPr>
-              <w:t xml:space="preserve">specular se ajusta </w:t>
+              <w:t xml:space="preserve">el </w:t>
+            </w:r>
+            <w:proofErr w:type="spellStart"/>
+            <w:r>
+              <w:rPr>
+                <w:rFonts w:asciiTheme="minorHAnsi" w:hAnsiTheme="minorHAnsi"/>
+                <w:sz w:val="20"/>
+                <w:szCs w:val="20"/>
+              </w:rPr>
+              <w:t>ramp</w:t>
+            </w:r>
+            <w:proofErr w:type="spellEnd"/>
+            <w:r>
+              <w:rPr>
+                <w:rFonts w:asciiTheme="minorHAnsi" w:hAnsiTheme="minorHAnsi"/>
+                <w:sz w:val="20"/>
+                <w:szCs w:val="20"/>
+              </w:rPr>
+              <w:t xml:space="preserve"> </w:t>
+            </w:r>
+            <w:proofErr w:type="spellStart"/>
+            <w:r>
+              <w:rPr>
+                <w:rFonts w:asciiTheme="minorHAnsi" w:hAnsiTheme="minorHAnsi"/>
+                <w:sz w:val="20"/>
+                <w:szCs w:val="20"/>
+              </w:rPr>
+              <w:t>shader</w:t>
+            </w:r>
+            <w:proofErr w:type="spellEnd"/>
+            <w:r>
+              <w:rPr>
+                <w:rFonts w:asciiTheme="minorHAnsi" w:hAnsiTheme="minorHAnsi"/>
+                <w:sz w:val="20"/>
+                <w:szCs w:val="20"/>
+              </w:rPr>
+              <w:t xml:space="preserve"> define la cohesión cromática</w:t>
+            </w:r>
+            <w:r>
+              <w:rPr>
+                <w:rFonts w:asciiTheme="minorHAnsi" w:hAnsiTheme="minorHAnsi"/>
+                <w:sz w:val="20"/>
+                <w:szCs w:val="20"/>
+              </w:rPr>
+              <w:t>, e</w:t>
+            </w:r>
+            <w:r>
+              <w:rPr>
+                <w:rFonts w:asciiTheme="minorHAnsi" w:hAnsiTheme="minorHAnsi"/>
+                <w:sz w:val="20"/>
+                <w:szCs w:val="20"/>
+              </w:rPr>
+              <w:t xml:space="preserve">l </w:t>
+            </w:r>
+            <w:proofErr w:type="spellStart"/>
+            <w:r>
+              <w:rPr>
+                <w:rFonts w:asciiTheme="minorHAnsi" w:hAnsiTheme="minorHAnsi"/>
+                <w:sz w:val="20"/>
+                <w:szCs w:val="20"/>
+              </w:rPr>
+              <w:t>noise</w:t>
+            </w:r>
+            <w:proofErr w:type="spellEnd"/>
+            <w:r>
+              <w:rPr>
+                <w:rFonts w:asciiTheme="minorHAnsi" w:hAnsiTheme="minorHAnsi"/>
+                <w:sz w:val="20"/>
+                <w:szCs w:val="20"/>
+              </w:rPr>
+              <w:t xml:space="preserve"> </w:t>
+            </w:r>
+            <w:proofErr w:type="spellStart"/>
+            <w:r>
+              <w:rPr>
+                <w:rFonts w:asciiTheme="minorHAnsi" w:hAnsiTheme="minorHAnsi"/>
+                <w:sz w:val="20"/>
+                <w:szCs w:val="20"/>
+              </w:rPr>
+              <w:t>shader</w:t>
+            </w:r>
+            <w:proofErr w:type="spellEnd"/>
+            <w:r>
+              <w:rPr>
+                <w:rFonts w:asciiTheme="minorHAnsi" w:hAnsiTheme="minorHAnsi"/>
+                <w:sz w:val="20"/>
+                <w:szCs w:val="20"/>
+              </w:rPr>
+              <w:t xml:space="preserve"> se utiliza para introducir </w:t>
+            </w:r>
+            <w:proofErr w:type="spellStart"/>
+            <w:r>
+              <w:rPr>
+                <w:rFonts w:asciiTheme="minorHAnsi" w:hAnsiTheme="minorHAnsi"/>
+                <w:sz w:val="20"/>
+                <w:szCs w:val="20"/>
+              </w:rPr>
+              <w:t>microvariaciones</w:t>
+            </w:r>
+            <w:proofErr w:type="spellEnd"/>
+            <w:r>
+              <w:rPr>
+                <w:rFonts w:asciiTheme="minorHAnsi" w:hAnsiTheme="minorHAnsi"/>
+                <w:sz w:val="20"/>
+                <w:szCs w:val="20"/>
+              </w:rPr>
+              <w:t xml:space="preserve"> superficiales que sugieren cualidades táctiles </w:t>
+            </w:r>
+            <w:r>
+              <w:rPr>
+                <w:rFonts w:asciiTheme="minorHAnsi" w:hAnsiTheme="minorHAnsi"/>
+                <w:sz w:val="20"/>
+                <w:szCs w:val="20"/>
+              </w:rPr>
+              <w:t xml:space="preserve">y el </w:t>
+            </w:r>
+            <w:proofErr w:type="spellStart"/>
+            <w:r>
+              <w:rPr>
+                <w:rFonts w:asciiTheme="minorHAnsi" w:hAnsiTheme="minorHAnsi"/>
+                <w:sz w:val="20"/>
+                <w:szCs w:val="20"/>
+              </w:rPr>
+              <w:t>specular</w:t>
+            </w:r>
+            <w:proofErr w:type="spellEnd"/>
+            <w:r>
+              <w:rPr>
+                <w:rFonts w:asciiTheme="minorHAnsi" w:hAnsiTheme="minorHAnsi"/>
+                <w:sz w:val="20"/>
+                <w:szCs w:val="20"/>
+              </w:rPr>
+              <w:t xml:space="preserve"> se ajusta </w:t>
             </w:r>
             <w:r>
               <w:rPr>
@@ -9165,7 +9446,20 @@
               <w:t>#00698A</w:t>
             </w:r>
             <w:r>
-              <w:t>, pero pintara los brazos, los pies, el tronco..etc, de tonos de azul cercanos dentro del rango cromático.</w:t>
+              <w:t xml:space="preserve">, pero pintara los brazos, los pies, el </w:t>
+            </w:r>
+            <w:proofErr w:type="gramStart"/>
+            <w:r>
+              <w:t>tronco..</w:t>
+            </w:r>
+            <w:proofErr w:type="spellStart"/>
+            <w:proofErr w:type="gramEnd"/>
+            <w:r>
+              <w:t>etc</w:t>
+            </w:r>
+            <w:proofErr w:type="spellEnd"/>
+            <w:r>
+              <w:t>, de tonos de azul cercanos dentro del rango cromático.</w:t>
             </w:r>
           </w:p>
         </w:tc>
@@ -9986,11 +10280,33 @@
               <w:pStyle w:val="Prrafodelista"/>
               <w:ind w:left="166"/>
             </w:pPr>
+            <w:proofErr w:type="spellStart"/>
             <w:r>
               <w:rPr>
                 <w:lang w:val="en-CA"/>
               </w:rPr>
-              <w:t>Estilo: Caricaturesco kawaii</w:t>
+              <w:t>Estilo</w:t>
+            </w:r>
+            <w:proofErr w:type="spellEnd"/>
+            <w:r>
+              <w:rPr>
+                <w:lang w:val="en-CA"/>
+              </w:rPr>
+              <w:t xml:space="preserve">: </w:t>
+            </w:r>
+            <w:proofErr w:type="spellStart"/>
+            <w:r>
+              <w:rPr>
+                <w:lang w:val="en-CA"/>
+              </w:rPr>
+              <w:t>Caricaturesco</w:t>
+            </w:r>
+            <w:proofErr w:type="spellEnd"/>
+            <w:r>
+              <w:rPr>
+                <w:lang w:val="en-CA"/>
+              </w:rPr>
+              <w:t xml:space="preserve"> kawaii</w:t>
             </w:r>
           </w:p>
         </w:tc>
@@ -10257,8 +10573,21 @@
                 <w:numId w:val="19"/>
               </w:numPr>
             </w:pPr>
-            <w:r>
-              <w:t>Toon shader (base estilizada)</w:t>
+            <w:proofErr w:type="spellStart"/>
+            <w:r>
+              <w:t>Toon</w:t>
+            </w:r>
+            <w:proofErr w:type="spellEnd"/>
+            <w:r>
+              <w:t xml:space="preserve"> </w:t>
+            </w:r>
+            <w:proofErr w:type="spellStart"/>
+            <w:r>
+              <w:t>shader</w:t>
+            </w:r>
+            <w:proofErr w:type="spellEnd"/>
+            <w:r>
+              <w:t xml:space="preserve"> (base estilizada)</w:t>
             </w:r>
           </w:p>
           <w:p>
@@ -10269,8 +10598,13 @@
                 <w:numId w:val="19"/>
               </w:numPr>
             </w:pPr>
-            <w:r>
-              <w:t>Ramp (gradientes de color)</w:t>
+            <w:proofErr w:type="spellStart"/>
+            <w:r>
+              <w:t>Ramp</w:t>
+            </w:r>
+            <w:proofErr w:type="spellEnd"/>
+            <w:r>
+              <w:t xml:space="preserve"> (gradientes de color)</w:t>
             </w:r>
           </w:p>
           <w:p>
@@ -10281,16 +10615,26 @@
                 <w:numId w:val="19"/>
               </w:numPr>
             </w:pPr>
-            <w:r>
-              <w:t>Noise (variación superficial)</w:t>
+            <w:proofErr w:type="spellStart"/>
+            <w:r>
+              <w:t>Noise</w:t>
+            </w:r>
+            <w:proofErr w:type="spellEnd"/>
+            <w:r>
+              <w:t xml:space="preserve"> (variación superficial)</w:t>
             </w:r>
           </w:p>
           <w:p>
             <w:pPr>
               <w:pStyle w:val="Prrafodelista"/>
             </w:pPr>
-            <w:r>
-              <w:t>Specular (sensación táctil)</w:t>
+            <w:proofErr w:type="spellStart"/>
+            <w:r>
+              <w:t>Specular</w:t>
+            </w:r>
+            <w:proofErr w:type="spellEnd"/>
+            <w:r>
+              <w:t xml:space="preserve"> (sensación táctil)</w:t>
             </w:r>
           </w:p>
         </w:tc>
@@ -11047,10 +11391,10 @@
                 <w:lang w:eastAsia="es-CO"/>
               </w:rPr>
               <w:drawing>
-                <wp:inline distT="0" distB="0" distL="0" distR="0" wp14:anchorId="634D1525" wp14:editId="5928B4B7">
-                  <wp:extent cx="1133295" cy="2776345"/>
-                  <wp:effectExtent l="0" t="0" r="0" b="5080"/>
-                  <wp:docPr id="12" name="Imagen 12"/>
+                <wp:inline distT="0" distB="0" distL="0" distR="0" wp14:anchorId="6F985EA8" wp14:editId="5900BB74">
+                  <wp:extent cx="1157605" cy="2878505"/>
+                  <wp:effectExtent l="0" t="0" r="4445" b="0"/>
+                  <wp:docPr id="17" name="Imagen 17"/>
                   <wp:cNvGraphicFramePr>
                     <a:graphicFrameLocks xmlns:a="http://schemas.openxmlformats.org/drawingml/2006/main" noChangeAspect="1"/>
                   </wp:cNvGraphicFramePr>
@@ -11061,20 +11405,27 @@
                           <pic:cNvPr id="1" name=""/>
                           <pic:cNvPicPr/>
                         </pic:nvPicPr>
-                        <pic:blipFill>
+                        <pic:blipFill rotWithShape="1">
                           <a:blip r:embed="rId48"/>
-                          <a:stretch>
-                            <a:fillRect/>
-                          </a:stretch>
+                          <a:srcRect t="617" b="1"/>
+                          <a:stretch/>
                         </pic:blipFill>
-                        <pic:spPr>
+                        <pic:spPr bwMode="auto">
                           <a:xfrm>
                             <a:off x="0" y="0"/>
-                            <a:ext cx="1139155" cy="2790702"/>
+                            <a:ext cx="1161165" cy="2887357"/>
                           </a:xfrm>
                           <a:prstGeom prst="rect">
                             <a:avLst/>
                           </a:prstGeom>
+                          <a:ln>
+                            <a:noFill/>
+                          </a:ln>
+                          <a:extLst>
+                            <a:ext uri="{53640926-AAD7-44D8-BBD7-CCE9431645EC}">
+                              <a14:shadowObscured xmlns:a14="http://schemas.microsoft.com/office/drawing/2010/main"/>
+                            </a:ext>
+                          </a:extLst>
                         </pic:spPr>
                       </pic:pic>
                     </a:graphicData>
@@ -11280,7 +11631,11 @@
               <w:t>Interpenetración</w:t>
             </w:r>
             <w:r>
-              <w:t xml:space="preserve"> o superposición de primitivas: SIEMPRE </w:t>
+              <w:t xml:space="preserve"> o superposición de primitivas: </w:t>
+            </w:r>
+            <w:proofErr w:type="gramStart"/>
+            <w:r>
+              <w:t xml:space="preserve">SIEMPRE </w:t>
             </w:r>
             <w:r>
               <w:rPr>
@@ -11296,7 +11651,16 @@
                 <w:bCs/>
                 <w:color w:val="00C6BB" w:themeColor="accent1"/>
               </w:rPr>
-              <w:t xml:space="preserve">“m” </w:t>
+              <w:t>“</w:t>
+            </w:r>
+            <w:proofErr w:type="gramEnd"/>
+            <w:r>
+              <w:rPr>
+                <w:b/>
+                <w:bCs/>
+                <w:color w:val="00C6BB" w:themeColor="accent1"/>
+              </w:rPr>
+              <w:t xml:space="preserve">m” </w:t>
             </w:r>
             <w:r>
               <w:rPr>
@@ -11653,7 +12017,15 @@
           <w:p/>
           <w:p>
             <w:r>
-              <w:t>Inicialmente, el código es desarrollado en el entorno de programación Visual Studio Code, utilizando el lenguaje Python para la implementación de la lógica generativa. Paralelamente, el control de versiones se gestiona mediante Git, lo que permite mantener un seguimiento organizado de los cambios y facilitar la iteración del sistema.</w:t>
+              <w:t xml:space="preserve">Inicialmente, el código es desarrollado en el entorno de programación Visual Studio </w:t>
+            </w:r>
+            <w:proofErr w:type="spellStart"/>
+            <w:r>
+              <w:t>Code</w:t>
+            </w:r>
+            <w:proofErr w:type="spellEnd"/>
+            <w:r>
+              <w:t>, utilizando el lenguaje Python para la implementación de la lógica generativa. Paralelamente, el control de versiones se gestiona mediante Git, lo que permite mantener un seguimiento organizado de los cambios y facilitar la iteración del sistema.</w:t>
             </w:r>
           </w:p>
           <w:p/>
@@ -12224,6 +12596,7 @@
         </w:rPr>
         <w:br/>
       </w:r>
+      <w:proofErr w:type="spellStart"/>
       <w:r>
         <w:rPr>
           <w:b/>
@@ -12231,7 +12604,17 @@
           <w:sz w:val="24"/>
           <w:szCs w:val="24"/>
         </w:rPr>
-        <w:t>Rigging procedural</w:t>
+        <w:t>Rigging</w:t>
+      </w:r>
+      <w:proofErr w:type="spellEnd"/>
+      <w:r>
+        <w:rPr>
+          <w:b/>
+          <w:bCs/>
+          <w:sz w:val="24"/>
+          <w:szCs w:val="24"/>
+        </w:rPr>
+        <w:t xml:space="preserve"> procedural</w:t>
       </w:r>
     </w:p>
     <w:p>
@@ -12246,7 +12629,23 @@
           <w:sz w:val="24"/>
           <w:szCs w:val="24"/>
         </w:rPr>
-        <w:t xml:space="preserve">El rigging procedural </w:t>
+        <w:t xml:space="preserve">El </w:t>
+      </w:r>
+      <w:proofErr w:type="spellStart"/>
+      <w:r>
+        <w:rPr>
+          <w:sz w:val="24"/>
+          <w:szCs w:val="24"/>
+        </w:rPr>
+        <w:t>rigging</w:t>
+      </w:r>
+      <w:proofErr w:type="spellEnd"/>
+      <w:r>
+        <w:rPr>
+          <w:sz w:val="24"/>
+          <w:szCs w:val="24"/>
+        </w:rPr>
+        <w:t xml:space="preserve"> procedural </w:t>
       </w:r>
       <w:r>
         <w:rPr>
@@ -12274,7 +12673,23 @@
           <w:sz w:val="24"/>
           <w:szCs w:val="24"/>
         </w:rPr>
-        <w:t xml:space="preserve"> de estructuras de control (rigs) basadas en reglas y configuraciones predefinidas, permitiendo que modelos generados dinámicamente puedan ser animados sin intervención manual directa en cada caso.</w:t>
+        <w:t xml:space="preserve"> de estructuras de control (</w:t>
+      </w:r>
+      <w:proofErr w:type="spellStart"/>
+      <w:r>
+        <w:rPr>
+          <w:sz w:val="24"/>
+          <w:szCs w:val="24"/>
+        </w:rPr>
+        <w:t>rigs</w:t>
+      </w:r>
+      <w:proofErr w:type="spellEnd"/>
+      <w:r>
+        <w:rPr>
+          <w:sz w:val="24"/>
+          <w:szCs w:val="24"/>
+        </w:rPr>
+        <w:t>) basadas en reglas y configuraciones predefinidas, permitiendo que modelos generados dinámicamente puedan ser animados sin intervención manual directa en cada caso.</w:t>
       </w:r>
     </w:p>
     <w:p>
@@ -12367,8 +12782,9 @@
           <w:szCs w:val="24"/>
           <w:lang w:eastAsia="es-CO"/>
         </w:rPr>
-        <w:t xml:space="preserve"> y  s</w:t>
-      </w:r>
+        <w:t xml:space="preserve"> </w:t>
+      </w:r>
+      <w:proofErr w:type="gramStart"/>
       <w:r>
         <w:rPr>
           <w:rFonts w:eastAsia="Times New Roman" w:cs="Times New Roman"/>
@@ -12376,7 +12792,66 @@
           <w:szCs w:val="24"/>
           <w:lang w:eastAsia="es-CO"/>
         </w:rPr>
-        <w:t>istema de columna (spine rig)</w:t>
+        <w:t>y  s</w:t>
+      </w:r>
+      <w:r>
+        <w:rPr>
+          <w:rFonts w:eastAsia="Times New Roman" w:cs="Times New Roman"/>
+          <w:sz w:val="24"/>
+          <w:szCs w:val="24"/>
+          <w:lang w:eastAsia="es-CO"/>
+        </w:rPr>
+        <w:t>istema</w:t>
+      </w:r>
+      <w:proofErr w:type="gramEnd"/>
+      <w:r>
+        <w:rPr>
+          <w:rFonts w:eastAsia="Times New Roman" w:cs="Times New Roman"/>
+          <w:sz w:val="24"/>
+          <w:szCs w:val="24"/>
+          <w:lang w:eastAsia="es-CO"/>
+        </w:rPr>
+        <w:t xml:space="preserve"> de columna (</w:t>
+      </w:r>
+      <w:proofErr w:type="spellStart"/>
+      <w:r>
+        <w:rPr>
+          <w:rFonts w:eastAsia="Times New Roman" w:cs="Times New Roman"/>
+          <w:sz w:val="24"/>
+          <w:szCs w:val="24"/>
+          <w:lang w:eastAsia="es-CO"/>
+        </w:rPr>
+        <w:t>spine</w:t>
+      </w:r>
+      <w:proofErr w:type="spellEnd"/>
+      <w:r>
+        <w:rPr>
+          <w:rFonts w:eastAsia="Times New Roman" w:cs="Times New Roman"/>
+          <w:sz w:val="24"/>
+          <w:szCs w:val="24"/>
+          <w:lang w:eastAsia="es-CO"/>
+        </w:rPr>
+        <w:t xml:space="preserve"> </w:t>
+      </w:r>
+      <w:proofErr w:type="spellStart"/>
+      <w:r>
+        <w:rPr>
+          <w:rFonts w:eastAsia="Times New Roman" w:cs="Times New Roman"/>
+          <w:sz w:val="24"/>
+          <w:szCs w:val="24"/>
+          <w:lang w:eastAsia="es-CO"/>
+        </w:rPr>
+        <w:t>rig</w:t>
+      </w:r>
+      <w:proofErr w:type="spellEnd"/>
+      <w:r>
+        <w:rPr>
+          <w:rFonts w:eastAsia="Times New Roman" w:cs="Times New Roman"/>
+          <w:sz w:val="24"/>
+          <w:szCs w:val="24"/>
+          <w:lang w:eastAsia="es-CO"/>
+        </w:rPr>
+        <w:t>)</w:t>
       </w:r>
       <w:r>
         <w:rPr>
@@ -12417,6 +12892,7 @@
           <w:szCs w:val="24"/>
         </w:rPr>
       </w:pPr>
+      <w:proofErr w:type="spellStart"/>
       <w:r>
         <w:rPr>
           <w:b/>
@@ -12424,7 +12900,17 @@
           <w:sz w:val="24"/>
           <w:szCs w:val="24"/>
         </w:rPr>
-        <w:t>Rigging procedural</w:t>
+        <w:t>Rigging</w:t>
+      </w:r>
+      <w:proofErr w:type="spellEnd"/>
+      <w:r>
+        <w:rPr>
+          <w:b/>
+          <w:bCs/>
+          <w:sz w:val="24"/>
+          <w:szCs w:val="24"/>
+        </w:rPr>
+        <w:t xml:space="preserve"> procedural</w:t>
       </w:r>
     </w:p>
     <w:p>
@@ -12472,8 +12958,19 @@
           <w:sz w:val="24"/>
           <w:szCs w:val="24"/>
         </w:rPr>
-        <w:t>Distribución del rig</w:t>
-      </w:r>
+        <w:t xml:space="preserve">Distribución del </w:t>
+      </w:r>
+      <w:proofErr w:type="spellStart"/>
+      <w:r>
+        <w:rPr>
+          <w:b/>
+          <w:bCs/>
+          <w:sz w:val="24"/>
+          <w:szCs w:val="24"/>
+        </w:rPr>
+        <w:t>rig</w:t>
+      </w:r>
+      <w:proofErr w:type="spellEnd"/>
     </w:p>
     <w:p>
       <w:pPr>
@@ -12550,7 +13047,23 @@
           <w:sz w:val="24"/>
           <w:szCs w:val="24"/>
         </w:rPr>
-        <w:t>FK (Forward Kinematics)</w:t>
+        <w:t xml:space="preserve">FK (Forward </w:t>
+      </w:r>
+      <w:proofErr w:type="spellStart"/>
+      <w:r>
+        <w:rPr>
+          <w:sz w:val="24"/>
+          <w:szCs w:val="24"/>
+        </w:rPr>
+        <w:t>Kinematics</w:t>
+      </w:r>
+      <w:proofErr w:type="spellEnd"/>
+      <w:r>
+        <w:rPr>
+          <w:sz w:val="24"/>
+          <w:szCs w:val="24"/>
+        </w:rPr>
+        <w:t>)</w:t>
       </w:r>
       <w:r>
         <w:rPr>
@@ -12578,21 +13091,53 @@
           <w:sz w:val="24"/>
           <w:szCs w:val="24"/>
         </w:rPr>
-        <w:t>IK (Inverse Kinematics)</w:t>
-      </w:r>
-      <w:r>
-        <w:rPr>
-          <w:sz w:val="24"/>
-          <w:szCs w:val="24"/>
-        </w:rPr>
-        <w:t xml:space="preserve"> o</w:t>
-      </w:r>
-      <w:r>
-        <w:rPr>
-          <w:sz w:val="24"/>
-          <w:szCs w:val="24"/>
-        </w:rPr>
-        <w:t>control por posición con estabilidad</w:t>
+        <w:t xml:space="preserve">IK (Inverse </w:t>
+      </w:r>
+      <w:proofErr w:type="spellStart"/>
+      <w:r>
+        <w:rPr>
+          <w:sz w:val="24"/>
+          <w:szCs w:val="24"/>
+        </w:rPr>
+        <w:t>Kinematics</w:t>
+      </w:r>
+      <w:proofErr w:type="spellEnd"/>
+      <w:r>
+        <w:rPr>
+          <w:sz w:val="24"/>
+          <w:szCs w:val="24"/>
+        </w:rPr>
+        <w:t>)</w:t>
+      </w:r>
+      <w:r>
+        <w:rPr>
+          <w:sz w:val="24"/>
+          <w:szCs w:val="24"/>
+        </w:rPr>
+        <w:t xml:space="preserve"> </w:t>
+      </w:r>
+      <w:proofErr w:type="spellStart"/>
+      <w:r>
+        <w:rPr>
+          <w:sz w:val="24"/>
+          <w:szCs w:val="24"/>
+        </w:rPr>
+        <w:t>o</w:t>
+      </w:r>
+      <w:r>
+        <w:rPr>
+          <w:sz w:val="24"/>
+          <w:szCs w:val="24"/>
+        </w:rPr>
+        <w:t>control</w:t>
+      </w:r>
+      <w:proofErr w:type="spellEnd"/>
+      <w:r>
+        <w:rPr>
+          <w:sz w:val="24"/>
+          <w:szCs w:val="24"/>
+        </w:rPr>
+        <w:t xml:space="preserve"> por posición con estabilidad</w:t>
       </w:r>
       <w:r>
         <w:rPr>
@@ -12640,8 +13185,17 @@
           <w:sz w:val="24"/>
           <w:szCs w:val="24"/>
         </w:rPr>
-        <w:t>El tronco se controla mediante un sistema de columna procedural (spine rig) basado en una curva spline, permitiendo:</w:t>
-      </w:r>
+        <w:t>El tronco se controla mediante un sistema de columna procedural (</w:t>
+      </w:r>
+      <w:proofErr w:type="spellStart"/>
+      <w:r>
+        <w:rPr>
+          <w:sz w:val="24"/>
+          <w:szCs w:val="24"/>
+        </w:rPr>
+        <w:t>spine</w:t>
+      </w:r>
+      <w:proofErr w:type="spellEnd"/>
       <w:r>
         <w:rPr>
           <w:sz w:val="24"/>
@@ -12649,6 +13203,45 @@
         </w:rPr>
         <w:t xml:space="preserve"> </w:t>
       </w:r>
+      <w:proofErr w:type="spellStart"/>
+      <w:r>
+        <w:rPr>
+          <w:sz w:val="24"/>
+          <w:szCs w:val="24"/>
+        </w:rPr>
+        <w:t>rig</w:t>
+      </w:r>
+      <w:proofErr w:type="spellEnd"/>
+      <w:r>
+        <w:rPr>
+          <w:sz w:val="24"/>
+          <w:szCs w:val="24"/>
+        </w:rPr>
+        <w:t xml:space="preserve">) basado en una curva </w:t>
+      </w:r>
+      <w:proofErr w:type="spellStart"/>
+      <w:r>
+        <w:rPr>
+          <w:sz w:val="24"/>
+          <w:szCs w:val="24"/>
+        </w:rPr>
+        <w:t>spline</w:t>
+      </w:r>
+      <w:proofErr w:type="spellEnd"/>
+      <w:r>
+        <w:rPr>
+          <w:sz w:val="24"/>
+          <w:szCs w:val="24"/>
+        </w:rPr>
+        <w:t>, permitiendo:</w:t>
+      </w:r>
+      <w:r>
+        <w:rPr>
+          <w:sz w:val="24"/>
+          <w:szCs w:val="24"/>
+        </w:rPr>
+        <w:t xml:space="preserve"> </w:t>
+      </w:r>
       <w:r>
         <w:rPr>
           <w:sz w:val="24"/>
@@ -12675,7 +13268,23 @@
           <w:sz w:val="24"/>
           <w:szCs w:val="24"/>
         </w:rPr>
-        <w:t xml:space="preserve">, ademas de </w:t>
+        <w:t xml:space="preserve">, </w:t>
+      </w:r>
+      <w:proofErr w:type="spellStart"/>
+      <w:r>
+        <w:rPr>
+          <w:sz w:val="24"/>
+          <w:szCs w:val="24"/>
+        </w:rPr>
+        <w:t>ademas</w:t>
+      </w:r>
+      <w:proofErr w:type="spellEnd"/>
+      <w:r>
+        <w:rPr>
+          <w:sz w:val="24"/>
+          <w:szCs w:val="24"/>
+        </w:rPr>
+        <w:t xml:space="preserve"> de </w:t>
       </w:r>
       <w:r>
         <w:rPr>
@@ -12805,6 +13414,7 @@
           <w:szCs w:val="24"/>
         </w:rPr>
       </w:pPr>
+      <w:proofErr w:type="spellStart"/>
       <w:r>
         <w:rPr>
           <w:b/>
@@ -12827,6 +13437,7 @@
         </w:rPr>
         <w:t>ireframe</w:t>
       </w:r>
+      <w:proofErr w:type="spellEnd"/>
       <w:r>
         <w:rPr>
           <w:b/>
@@ -12889,7 +13500,39 @@
           <w:sz w:val="24"/>
           <w:szCs w:val="24"/>
         </w:rPr>
-        <w:t xml:space="preserve">La primera sección corresponde a la selección de primitivas geométricas base, mediante casillas de verificación (checkbox). El usuario podrá elegir entre seis opciones: esfera, cubo, cilindro, cono, toroide y plano. </w:t>
+        <w:t xml:space="preserve">La primera sección corresponde a la selección de primitivas </w:t>
+      </w:r>
+      <w:proofErr w:type="gramStart"/>
+      <w:r>
+        <w:rPr>
+          <w:sz w:val="24"/>
+          <w:szCs w:val="24"/>
+        </w:rPr>
+        <w:t>geométricas base</w:t>
+      </w:r>
+      <w:proofErr w:type="gramEnd"/>
+      <w:r>
+        <w:rPr>
+          <w:sz w:val="24"/>
+          <w:szCs w:val="24"/>
+        </w:rPr>
+        <w:t>, mediante casillas de verificación (</w:t>
+      </w:r>
+      <w:proofErr w:type="spellStart"/>
+      <w:r>
+        <w:rPr>
+          <w:sz w:val="24"/>
+          <w:szCs w:val="24"/>
+        </w:rPr>
+        <w:t>checkbox</w:t>
+      </w:r>
+      <w:proofErr w:type="spellEnd"/>
+      <w:r>
+        <w:rPr>
+          <w:sz w:val="24"/>
+          <w:szCs w:val="24"/>
+        </w:rPr>
+        <w:t xml:space="preserve">). El usuario podrá elegir entre seis opciones: esfera, cubo, cilindro, cono, toroide y plano. </w:t>
       </w:r>
       <w:r>
         <w:rPr>
@@ -12974,7 +13617,23 @@
           <w:sz w:val="24"/>
           <w:szCs w:val="24"/>
         </w:rPr>
-        <w:t xml:space="preserve"> también a través de checkbox. Las opciones disponibles serán:</w:t>
+        <w:t xml:space="preserve"> también a través de </w:t>
+      </w:r>
+      <w:proofErr w:type="spellStart"/>
+      <w:r>
+        <w:rPr>
+          <w:sz w:val="24"/>
+          <w:szCs w:val="24"/>
+        </w:rPr>
+        <w:t>checkbox</w:t>
+      </w:r>
+      <w:proofErr w:type="spellEnd"/>
+      <w:r>
+        <w:rPr>
+          <w:sz w:val="24"/>
+          <w:szCs w:val="24"/>
+        </w:rPr>
+        <w:t>. Las opciones disponibles serán:</w:t>
       </w:r>
     </w:p>
     <w:p>
@@ -13125,7 +13784,23 @@
           <w:szCs w:val="24"/>
         </w:rPr>
         <w:lastRenderedPageBreak/>
-        <w:t>emoción se traducirá en una paleta cromática monocromática en tonos pastel y en variaciones de shader que sugieren cualidades táctiles y sensoriales:</w:t>
+        <w:t xml:space="preserve">emoción se traducirá en una paleta cromática monocromática en tonos pastel y en variaciones de </w:t>
+      </w:r>
+      <w:proofErr w:type="spellStart"/>
+      <w:r>
+        <w:rPr>
+          <w:sz w:val="24"/>
+          <w:szCs w:val="24"/>
+        </w:rPr>
+        <w:t>shader</w:t>
+      </w:r>
+      <w:proofErr w:type="spellEnd"/>
+      <w:r>
+        <w:rPr>
+          <w:sz w:val="24"/>
+          <w:szCs w:val="24"/>
+        </w:rPr>
+        <w:t xml:space="preserve"> que sugieren cualidades táctiles y sensoriales:</w:t>
       </w:r>
     </w:p>
     <w:p>
@@ -13305,12 +13980,37 @@
           <w:szCs w:val="24"/>
         </w:rPr>
       </w:pPr>
-      <w:r>
-        <w:rPr>
-          <w:sz w:val="24"/>
-          <w:szCs w:val="24"/>
-        </w:rPr>
-        <w:t>Noise: para introducir microvariaciones sutiles en la superficie</w:t>
+      <w:proofErr w:type="spellStart"/>
+      <w:r>
+        <w:rPr>
+          <w:sz w:val="24"/>
+          <w:szCs w:val="24"/>
+        </w:rPr>
+        <w:t>Noise</w:t>
+      </w:r>
+      <w:proofErr w:type="spellEnd"/>
+      <w:r>
+        <w:rPr>
+          <w:sz w:val="24"/>
+          <w:szCs w:val="24"/>
+        </w:rPr>
+        <w:t xml:space="preserve">: para introducir </w:t>
+      </w:r>
+      <w:proofErr w:type="spellStart"/>
+      <w:r>
+        <w:rPr>
+          <w:sz w:val="24"/>
+          <w:szCs w:val="24"/>
+        </w:rPr>
+        <w:t>microvariaciones</w:t>
+      </w:r>
+      <w:proofErr w:type="spellEnd"/>
+      <w:r>
+        <w:rPr>
+          <w:sz w:val="24"/>
+          <w:szCs w:val="24"/>
+        </w:rPr>
+        <w:t xml:space="preserve"> sutiles en la superficie</w:t>
       </w:r>
       <w:r>
         <w:rPr>
@@ -13332,12 +14032,37 @@
           <w:szCs w:val="24"/>
         </w:rPr>
       </w:pPr>
-      <w:r>
-        <w:rPr>
-          <w:sz w:val="24"/>
-          <w:szCs w:val="24"/>
-        </w:rPr>
-        <w:t>Gradient Ramp: para generar transiciones suaves de color que refuercen la cohesión cromática y la profundidad visual.</w:t>
+      <w:proofErr w:type="spellStart"/>
+      <w:r>
+        <w:rPr>
+          <w:sz w:val="24"/>
+          <w:szCs w:val="24"/>
+        </w:rPr>
+        <w:t>Gradient</w:t>
+      </w:r>
+      <w:proofErr w:type="spellEnd"/>
+      <w:r>
+        <w:rPr>
+          <w:sz w:val="24"/>
+          <w:szCs w:val="24"/>
+        </w:rPr>
+        <w:t xml:space="preserve"> </w:t>
+      </w:r>
+      <w:proofErr w:type="spellStart"/>
+      <w:r>
+        <w:rPr>
+          <w:sz w:val="24"/>
+          <w:szCs w:val="24"/>
+        </w:rPr>
+        <w:t>Ramp</w:t>
+      </w:r>
+      <w:proofErr w:type="spellEnd"/>
+      <w:r>
+        <w:rPr>
+          <w:sz w:val="24"/>
+          <w:szCs w:val="24"/>
+        </w:rPr>
+        <w:t>: para generar transiciones suaves de color que refuercen la cohesión cromática y la profundidad visual.</w:t>
       </w:r>
     </w:p>
     <w:p>
@@ -13352,12 +14077,21 @@
           <w:szCs w:val="24"/>
         </w:rPr>
       </w:pPr>
-      <w:r>
-        <w:rPr>
-          <w:sz w:val="24"/>
-          <w:szCs w:val="24"/>
-        </w:rPr>
-        <w:t>Specular: para controlar el nivel de brillo y reflejo, aportando sensaciones como suavidad, opacidad o tersura según la emoción seleccionada.</w:t>
+      <w:proofErr w:type="spellStart"/>
+      <w:r>
+        <w:rPr>
+          <w:sz w:val="24"/>
+          <w:szCs w:val="24"/>
+        </w:rPr>
+        <w:t>Specular</w:t>
+      </w:r>
+      <w:proofErr w:type="spellEnd"/>
+      <w:r>
+        <w:rPr>
+          <w:sz w:val="24"/>
+          <w:szCs w:val="24"/>
+        </w:rPr>
+        <w:t>: para controlar el nivel de brillo y reflejo, aportando sensaciones como suavidad, opacidad o tersura según la emoción seleccionada.</w:t>
       </w:r>
     </w:p>
     <w:p>
@@ -13409,12 +14143,21 @@
           <w:szCs w:val="24"/>
         </w:rPr>
       </w:pPr>
-      <w:r>
-        <w:rPr>
-          <w:sz w:val="24"/>
-          <w:szCs w:val="24"/>
-        </w:rPr>
-        <w:t>Randomizar, que asignará valores aleatorios tanto a las primitivas, morfología y emoción, generando resultados inesperados que fomentan la exploración creativa.</w:t>
+      <w:proofErr w:type="spellStart"/>
+      <w:r>
+        <w:rPr>
+          <w:sz w:val="24"/>
+          <w:szCs w:val="24"/>
+        </w:rPr>
+        <w:t>Randomizar</w:t>
+      </w:r>
+      <w:proofErr w:type="spellEnd"/>
+      <w:r>
+        <w:rPr>
+          <w:sz w:val="24"/>
+          <w:szCs w:val="24"/>
+        </w:rPr>
+        <w:t>, que asignará valores aleatorios tanto a las primitivas, morfología y emoción, generando resultados inesperados que fomentan la exploración creativa.</w:t>
       </w:r>
     </w:p>
     <w:p>

</xml_diff>